<commit_message>
Add editable shoots and ten-case live evaluation
Adds validated CSV input, persistent shoot revisions, human alternatives, 25 passing tests, and 10 successful fictional live evaluation cases. Includes refreshed report and recording guide; credentials and runtime databases excluded.
</commit_message>
<xml_diff>
--- a/FitLore Rescue Project Report.docx
+++ b/FitLore Rescue Project Report.docx
@@ -25,7 +25,7 @@
     </w:p>
     <w:p>
       <w:r>
-        <w:t>The prototype completed a live recovery after an injected inventory failure. A second live run found no qualifying replacement and handed control back without changing the plan. These two runs demonstrate specific behaviors; they do not establish a general success rate.</w:t>
+        <w:t>FitLore combines editable shoot briefs, CSV wardrobe import, model-selected tools, durable approval and transaction-safe updates. Ten fictional live evaluation cases passed their defined acceptance criteria. These bounded tests are evidence of behavior, not a general reliability guarantee.</w:t>
       </w:r>
     </w:p>
     <w:p>
@@ -414,7 +414,7 @@
     </w:p>
     <w:p>
       <w:r>
-        <w:t>A valid recovery ends with a reviewed plan update, or a specific handoff when no safe replacement exists. No unapproved or invalid replacement may be applied. The next evaluation target is ten varied scenarios with measured completion time; that larger evaluation has not yet been run.</w:t>
+        <w:t>Target: at least 8 of 10 varied cases reach the correct completion, rejection or handoff within 180 seconds of system processing, with zero writes before approval. Manual coordination is estimated at 10–15 minutes per incident; that baseline is an assumption, not a measured saving.</w:t>
       </w:r>
     </w:p>
     <w:p>
@@ -928,7 +928,7 @@
                 <w:b w:val="0"/>
                 <w:sz w:val="20"/>
               </w:rPr>
-              <w:t>20 model attempts for this authorized session; 10 steps per run</w:t>
+              <w:t>80 model attempts authorized; 10 steps per run; at least six reserved for recording</w:t>
             </w:r>
           </w:p>
         </w:tc>
@@ -954,7 +954,7 @@
     </w:p>
     <w:p>
       <w:r>
-        <w:t>The model cannot directly write the plan. After approval, the transaction rechecks the project revision and candidate constraints. A unique run identifier prevents a repeated apply from duplicating the update. Rejection leaves the plan unchanged.</w:t>
+        <w:t>The model cannot write the plan. A reviewer can approve, reject or choose another validated candidate. The transaction rechecks the saved shoot revision and candidate constraints, then updates the saved shoot and run snapshot together. A unique run ID prevents duplicate writes.</w:t>
       </w:r>
     </w:p>
     <w:p>
@@ -1383,7 +1383,7 @@
                 <w:b w:val="0"/>
                 <w:sz w:val="20"/>
               </w:rPr>
-              <w:t>Deterministic test cases and two saved live Nebius investigations</w:t>
+              <w:t>25 deterministic tests, two exploratory live runs and ten structured live evaluation cases</w:t>
             </w:r>
           </w:p>
         </w:tc>
@@ -1707,7 +1707,7 @@
     </w:p>
     <w:p>
       <w:r>
-        <w:t>The recovery run unnecessarily reread the brief once. In the no-match run, the model initially selected a late-arriving jacket and then an unavailable jacket. Code rejected both. The final handoff correctly identified the timing, availability, color and size conflicts. All 14 requests count toward the 20-request allowance.</w:t>
+        <w:t>The table shows the two original exploratory runs. The subsequent ten-case evaluation passed standard recovery, retry, permanent outage, no match, rejection, a white-shirt brief, insufficient budget, injected instructions, stale approval and size mismatch. System times were under 7 seconds; simulated reviewer time is excluded. Full timings, actions and outcomes are in live-evaluation.json.</w:t>
       </w:r>
     </w:p>
     <w:p>
@@ -1720,7 +1720,7 @@
     </w:p>
     <w:p>
       <w:r>
-        <w:t>17 automated tests passed. They cover approval, duplicate writes, rejection, checkpoint reopening, transient and permanent failure, no-match handoff, stale approval, changed availability, invalid candidates, skipped evidence, provider failure and the request ceiling. The tests use a deterministic decision driver; they do not measure model quality.</w:t>
+        <w:t>25 automated tests passed, covering the original approval, persistence and failure controls plus saved-shoot updates, concurrent edits, human alternatives, custom categories, CSV validation and the expanded request cap. These deterministic tests are separate from the live model evaluation.</w:t>
       </w:r>
     </w:p>
     <w:p>
@@ -1733,7 +1733,7 @@
     </w:p>
     <w:p>
       <w:r>
-        <w:t>This is a single-user localhost prototype with fictional inventory. It does not verify retailer stock, analyze garment images, guarantee physical fit, reserve garments, send messages or spend money. Each investigation starts an independent scenario copy. Fit and photographer approval remain human tasks. Remote deployment and multi-user authentication are outside this build.</w:t>
+        <w:t>This single-user localhost prototype accepts editable briefs, CSV wardrobe records and affected looks. Saved shoots persist across investigations; demo scenarios use independent copies. Evaluation data is fictional. It cannot verify live stock or physical fit, reserve garments, send messages or spend money. Remote deployment and authentication remain outside scope.</w:t>
       </w:r>
     </w:p>
     <w:p>
@@ -1755,7 +1755,7 @@
     </w:p>
     <w:p>
       <w:r>
-        <w:t>Codex inspected the previous FitLore implementation, translated the Week 3 handout into a bounded rescue workflow, wrote the backend and interface, and tested the browser flow. The user selected FitLore and authorized up to 20 Nebius requests for fictional demo data.</w:t>
+        <w:t>Codex inspected Week 2, translated the handout into a focused workflow, built the interface and backend, and tested the browser flow. The user first authorized 20 Nebius requests, then extended the total to 80 for fictional evaluation data.</w:t>
       </w:r>
     </w:p>
     <w:p>
@@ -1768,7 +1768,7 @@
     </w:p>
     <w:p>
       <w:r>
-        <w:t>The user’s project direction was “lets build on fitlore”. The build focused on this request: “The hero jacket is unavailable. Rescue tomorrow’s shoot within the brief and budget.”</w:t>
+        <w:t>User prompts included “lets build on fitlore” and “fix all partial, missing, mostly meets, meets all of those as exceeded”. These drove a focused rescue workflow, then editable shoots, validated alternatives and a measured evaluation. Runtime task: “Rescue tomorrow’s shoot within the brief and budget.”</w:t>
       </w:r>
     </w:p>
     <w:p>
@@ -2050,7 +2050,7 @@
                 <w:b w:val="0"/>
                 <w:sz w:val="20"/>
               </w:rPr>
-              <w:t>Added failure, stale-plan and provider-error tests; exercised two real model runs</w:t>
+              <w:t>Added 25 tests and ten structured live cases, including changed briefs and injected instructions</w:t>
             </w:r>
           </w:p>
         </w:tc>
@@ -2115,7 +2115,7 @@
                 <w:b w:val="0"/>
                 <w:sz w:val="20"/>
               </w:rPr>
-              <w:t>Bounded the timeline height, improved replacement-image framing, and fixed polling of the intermediate approved state</w:t>
+              <w:t>Added reusable shoot editor, CSV import and validated alternatives; verified browser save and approval</w:t>
             </w:r>
           </w:p>
         </w:tc>
@@ -2141,7 +2141,7 @@
     </w:p>
     <w:p>
       <w:r>
-        <w:t>Next improvements are broader live evaluation, fewer repeated reads, editable shoot constraints, and an authenticated inventory integration. Those are future work, not current capabilities.</w:t>
+        <w:t>The expanded evaluation and editable shoots are implemented. Next work is an authenticated inventory integration and independent stylist testing. Local records remain until the operator removes the runtime database; no automatic expiry or learned preferences are implemented.</w:t>
       </w:r>
     </w:p>
     <w:p>
@@ -2160,7 +2160,7 @@
         <w:br/>
         <w:t>Photo source links: web/images/credits.json</w:t>
         <w:br/>
-        <w:t>Live run evidence: output/submission/live-evidence.json</w:t>
+        <w:t>Live evidence: output/submission/live-evidence.json and live-evaluation.json</w:t>
       </w:r>
     </w:p>
     <w:sectPr>
@@ -2886,6 +2886,9 @@
     <w:qFormat/>
     <w:rsid w:val="00FC693F"/>
     <w:pPr>
+      <w:pBdr>
+        <w:bottom w:val="single" w:sz="8" w:space="4" w:color="4F81BD" w:themeColor="accent1"/>
+      </w:pBdr>
       <w:spacing w:after="300" w:line="240" w:lineRule="auto"/>
       <w:contextualSpacing/>
     </w:pPr>

</xml_diff>

<commit_message>
Measure full workflow success including human review
</commit_message>
<xml_diff>
--- a/FitLore Rescue Project Report.docx
+++ b/FitLore Rescue Project Report.docx
@@ -414,7 +414,7 @@
     </w:p>
     <w:p>
       <w:r>
-        <w:t>Target: at least 8 of 10 varied cases reach the correct completion, rejection or handoff within 180 seconds of system processing, with zero writes before approval. Manual coordination is estimated at 10–15 minutes per incident; that baseline is an assumption, not a measured saving.</w:t>
+        <w:t>User-workflow target: at least 8 of 10 live starts yield an operator-confirmed usable revised plan within 180 seconds, including human review. New runs record processing, approval wait and total time to confirmation. Handoffs, rejections and unreviewed starts do not count as successful recoveries. User trials are still pending.</w:t>
       </w:r>
     </w:p>
     <w:p>
@@ -1383,7 +1383,7 @@
                 <w:b w:val="0"/>
                 <w:sz w:val="20"/>
               </w:rPr>
-              <w:t>25 deterministic tests, two exploratory live runs and ten structured live evaluation cases</w:t>
+              <w:t>32 deterministic tests, two exploratory live runs and ten structured live evaluation cases</w:t>
             </w:r>
           </w:p>
         </w:tc>
@@ -1720,7 +1720,7 @@
     </w:p>
     <w:p>
       <w:r>
-        <w:t>25 automated tests passed, covering the original approval, persistence and failure controls plus saved-shoot updates, concurrent edits, human alternatives, custom categories, CSV validation and the expanded request cap. These deterministic tests are separate from the live model evaluation.</w:t>
+        <w:t>32 automated tests passed, covering the original approval, persistence and failure controls plus saved-shoot updates, concurrent edits, human alternatives, custom categories, CSV validation and the expanded request cap. These deterministic tests are separate from the live model evaluation.</w:t>
       </w:r>
     </w:p>
     <w:p>
@@ -2050,7 +2050,7 @@
                 <w:b w:val="0"/>
                 <w:sz w:val="20"/>
               </w:rPr>
-              <w:t>Added 25 tests and ten structured live cases, including changed briefs and injected instructions</w:t>
+              <w:t>Added 32 tests and ten structured live cases, including changed briefs and injected instructions</w:t>
             </w:r>
           </w:p>
         </w:tc>

</xml_diff>